<commit_message>
Phases 121, 122, 128: Description intel, POC extraction, federal identifier extraction
Phase 121 (IN PROGRESS): AI analysis of opportunity descriptions
- New analyze_descriptions CLI command (extract description-ai)
- Combined description + attachment text for AI context
- API fix for description-only intel display
- Opus model option removed (ENUM prerequisite)

Phase 122 (COMPLETE): Point of contact extraction
- POC data from raw JSON via backfill pocs CLI command
- C# API returns POCs in opportunity detail DTO
- UI card with name, type, title, email, phone, fax

Phase 128 (IN PROGRESS): Federal identifier extraction
- Regex extraction for 10 identifier types (PIID, UEI, CAGE, etc.)
- document_identifier_ref table + SQL views for cross-referencing
- Dual search (dashed + dashless) for cross-ref matching
- New API endpoint GET /api/opportunities/{noticeId}/identifier-refs
- Phase 132 planned for full dash normalization

Also includes: Phase 114 doc moved to completed, updated docs
</commit_message>
<xml_diff>
--- a/docs/admin/FedProspect-Admin-Guide.docx
+++ b/docs/admin/FedProspect-Admin-Guide.docx
@@ -33,7 +33,7 @@
           <w:color w:val="666666"/>
           <w:sz w:val="28"/>
         </w:rPr>
-        <w:t>Version 1.0 - March 22, 2026</w:t>
+        <w:t>Version 1.0 - March 29, 2026</w:t>
       </w:r>
     </w:p>
     <w:p/>
@@ -843,7 +843,7 @@
     </w:p>
     <w:p>
       <w:r>
-        <w:t>The daily load script (daily_load.bat) runs a 10-step pipeline that fetches data from government APIs, downloads attachments, extracts text, and performs intelligence extraction. It is designed to run once per day.</w:t>
+        <w:t>The daily load script (daily_load.bat) runs a 13-step pipeline that fetches data from government APIs, backfills descriptions, downloads attachments, extracts text, and performs intelligence extraction. It is designed to run once per day.</w:t>
       </w:r>
     </w:p>
     <w:p>
@@ -928,7 +928,36 @@
         <w:pStyle w:val="Heading3"/>
       </w:pPr>
       <w:r>
-        <w:t>Step 2: Load USASpending Bulk</w:t>
+        <w:t>Step 2: Fetch Missing Descriptions</w:t>
+      </w:r>
+    </w:p>
+    <w:p>
+      <w:pPr>
+        <w:pStyle w:val="Code"/>
+      </w:pPr>
+      <w:r>
+        <w:t>python main.py update fetch-descriptions --key 2 --limit 100 --naics &lt;NAICS&gt; --set-aside WOSB,8A,SBA</w:t>
+      </w:r>
+    </w:p>
+    <w:p>
+      <w:r>
+        <w:t>Backfills opportunity description text from SAM.gov. Uses a two-pass prioritized approach: first fetches descriptions for high-value opportunities (matching target NAICS codes and WOSB/8(a)/SBA set-asides), then uses remaining budget for the general backlog. Limited to 100 descriptions per daily run to stay within Key 2's 1,000/day quota (shared with other steps).</w:t>
+      </w:r>
+    </w:p>
+    <w:p>
+      <w:r>
+        <w:rPr>
+          <w:i/>
+        </w:rPr>
+        <w:t>Expected duration: 1-5 minutes.</w:t>
+      </w:r>
+    </w:p>
+    <w:p>
+      <w:pPr>
+        <w:pStyle w:val="Heading3"/>
+      </w:pPr>
+      <w:r>
+        <w:t>Step 3: Load USASpending Bulk</w:t>
       </w:r>
     </w:p>
     <w:p>
@@ -957,7 +986,7 @@
         <w:pStyle w:val="Heading3"/>
       </w:pPr>
       <w:r>
-        <w:t>Step 3: Load Awards - 8(a) Set-Aside</w:t>
+        <w:t>Step 4: Load Awards - 8(a) Set-Aside</w:t>
       </w:r>
     </w:p>
     <w:p>
@@ -965,7 +994,7 @@
         <w:pStyle w:val="Code"/>
       </w:pPr>
       <w:r>
-        <w:t>python main.py load awards --naics &lt;NAICS&gt; --days-back 10 --max-calls 300 --key 2 --set-aside 8a</w:t>
+        <w:t>python main.py load awards --naics &lt;NAICS&gt; --days-back 10 --max-calls 100 --key 2 --set-aside 8a</w:t>
       </w:r>
     </w:p>
     <w:p>
@@ -986,7 +1015,7 @@
         <w:pStyle w:val="Heading3"/>
       </w:pPr>
       <w:r>
-        <w:t>Step 4: Load Awards - WOSB Set-Aside</w:t>
+        <w:t>Step 5: Load Awards - WOSB Set-Aside</w:t>
       </w:r>
     </w:p>
     <w:p>
@@ -994,12 +1023,12 @@
         <w:pStyle w:val="Code"/>
       </w:pPr>
       <w:r>
-        <w:t>python main.py load awards --naics &lt;NAICS&gt; --days-back 10 --max-calls 300 --key 2 --set-aside WOSB</w:t>
-      </w:r>
-    </w:p>
-    <w:p>
-      <w:r>
-        <w:t>Same as Step 3 but for WOSB (Women-Owned Small Business) set-aside awards.</w:t>
+        <w:t>python main.py load awards --naics &lt;NAICS&gt; --days-back 10 --max-calls 100 --key 2 --set-aside WOSB</w:t>
+      </w:r>
+    </w:p>
+    <w:p>
+      <w:r>
+        <w:t>Same as Step 4 but for WOSB (Women-Owned Small Business) set-aside awards.</w:t>
       </w:r>
     </w:p>
     <w:p>
@@ -1015,7 +1044,7 @@
         <w:pStyle w:val="Heading3"/>
       </w:pPr>
       <w:r>
-        <w:t>Step 5: Load Awards - SBA Set-Aside</w:t>
+        <w:t>Step 6: Load Awards - SBA Set-Aside</w:t>
       </w:r>
     </w:p>
     <w:p>
@@ -1023,12 +1052,12 @@
         <w:pStyle w:val="Code"/>
       </w:pPr>
       <w:r>
-        <w:t>python main.py load awards --naics &lt;NAICS&gt; --days-back 10 --max-calls 300 --key 2 --set-aside SBA</w:t>
-      </w:r>
-    </w:p>
-    <w:p>
-      <w:r>
-        <w:t>Same as Step 3 but for SBA (Small Business Administration) set-aside awards.</w:t>
+        <w:t>python main.py load awards --naics &lt;NAICS&gt; --days-back 10 --max-calls 100 --key 2 --set-aside SBA</w:t>
+      </w:r>
+    </w:p>
+    <w:p>
+      <w:r>
+        <w:t>Same as Step 4 but for SBA (Small Business Administration) set-aside awards.</w:t>
       </w:r>
     </w:p>
     <w:p>
@@ -1044,7 +1073,7 @@
         <w:pStyle w:val="Heading3"/>
       </w:pPr>
       <w:r>
-        <w:t>Step 6: Enrich Resource Link Metadata</w:t>
+        <w:t>Step 7: Enrich Resource Link Metadata</w:t>
       </w:r>
     </w:p>
     <w:p>
@@ -1073,7 +1102,7 @@
         <w:pStyle w:val="Heading3"/>
       </w:pPr>
       <w:r>
-        <w:t>Step 7: Download Attachments</w:t>
+        <w:t>Step 8: Download Attachments</w:t>
       </w:r>
     </w:p>
     <w:p>
@@ -1102,7 +1131,7 @@
         <w:pStyle w:val="Heading3"/>
       </w:pPr>
       <w:r>
-        <w:t>Step 8: Extract Attachment Text</w:t>
+        <w:t>Step 9: Extract Attachment Text</w:t>
       </w:r>
     </w:p>
     <w:p>
@@ -1110,7 +1139,7 @@
         <w:pStyle w:val="Code"/>
       </w:pPr>
       <w:r>
-        <w:t>python main.py extract attachment-text --batch-size 5000</w:t>
+        <w:t>python main.py extract attachment-text --batch-size 5000 --workers 10</w:t>
       </w:r>
     </w:p>
     <w:p>
@@ -1131,7 +1160,7 @@
         <w:pStyle w:val="Heading3"/>
       </w:pPr>
       <w:r>
-        <w:t>Step 9: Extract Attachment Intelligence</w:t>
+        <w:t>Step 10: Extract Attachment Intelligence</w:t>
       </w:r>
     </w:p>
     <w:p>
@@ -1160,7 +1189,7 @@
         <w:pStyle w:val="Heading3"/>
       </w:pPr>
       <w:r>
-        <w:t>Step 10: Clean Up Attachment Files</w:t>
+        <w:t>Step 11: AI Analysis (Disabled)</w:t>
       </w:r>
     </w:p>
     <w:p>
@@ -1168,7 +1197,65 @@
         <w:pStyle w:val="Code"/>
       </w:pPr>
       <w:r>
-        <w:t>python main.py cleanup attachment-files</w:t>
+        <w:t>python main.py extract attachment-ai --model haiku --batch-size 50</w:t>
+      </w:r>
+    </w:p>
+    <w:p>
+      <w:r>
+        <w:t>Runs Claude AI deep analysis on attachment text. Currently disabled in daily_load.bat to save on costs. Can be run on demand for specific opportunities when needed.</w:t>
+      </w:r>
+    </w:p>
+    <w:p>
+      <w:r>
+        <w:rPr>
+          <w:i/>
+        </w:rPr>
+        <w:t>Expected duration: 5-30 minutes (when enabled).</w:t>
+      </w:r>
+    </w:p>
+    <w:p>
+      <w:pPr>
+        <w:pStyle w:val="Heading3"/>
+      </w:pPr>
+      <w:r>
+        <w:t>Step 12: Backfill Opportunity Intel</w:t>
+      </w:r>
+    </w:p>
+    <w:p>
+      <w:pPr>
+        <w:pStyle w:val="Code"/>
+      </w:pPr>
+      <w:r>
+        <w:t>python main.py backfill opportunity-intel</w:t>
+      </w:r>
+    </w:p>
+    <w:p>
+      <w:r>
+        <w:t>Backfills opportunity-level intelligence columns from attachment analysis results. Aggregates extracted data across all attachments for each opportunity.</w:t>
+      </w:r>
+    </w:p>
+    <w:p>
+      <w:r>
+        <w:rPr>
+          <w:i/>
+        </w:rPr>
+        <w:t>Expected duration: 1-5 minutes.</w:t>
+      </w:r>
+    </w:p>
+    <w:p>
+      <w:pPr>
+        <w:pStyle w:val="Heading3"/>
+      </w:pPr>
+      <w:r>
+        <w:t>Step 13: Clean Up Attachment Files</w:t>
+      </w:r>
+    </w:p>
+    <w:p>
+      <w:pPr>
+        <w:pStyle w:val="Code"/>
+      </w:pPr>
+      <w:r>
+        <w:t>python main.py maintain attachment-files</w:t>
       </w:r>
     </w:p>
     <w:p>
@@ -1915,7 +2002,7 @@
         <w:rPr>
           <w:b/>
         </w:rPr>
-        <w:t>analyze attachments</w:t>
+        <w:t>extract attachment-ai</w:t>
       </w:r>
       <w:r>
         <w:t xml:space="preserve"> - Analyze attachment content using Claude AI (Phase 110C)</w:t>
@@ -2046,21 +2133,73 @@
         <w:rPr>
           <w:b/>
         </w:rPr>
+        <w:t>update build-relationships</w:t>
+      </w:r>
+      <w:r>
+        <w:t xml:space="preserve"> - Detect opportunity lifecycle relationships (RFI-&gt;RFP, PRESOL-&gt;SOL, SOL-&gt;AWARD)</w:t>
+      </w:r>
+    </w:p>
+    <w:p>
+      <w:pPr>
+        <w:pStyle w:val="Heading3"/>
+      </w:pPr>
+      <w:r>
         <w:t>update fetch-descriptions</w:t>
       </w:r>
-      <w:r>
-        <w:t xml:space="preserve"> - Fetch and cache opportunity description text from SAM.gov. Options: --missing-only/--all, --batch-size</w:t>
-      </w:r>
-    </w:p>
-    <w:p>
-      <w:r>
-        <w:rPr>
-          <w:b/>
-        </w:rPr>
-        <w:t>update build-relationships</w:t>
-      </w:r>
-      <w:r>
-        <w:t xml:space="preserve"> - Detect opportunity lifecycle relationships (RFI-&gt;RFP, PRESOL-&gt;SOL, SOL-&gt;AWARD)</w:t>
+    </w:p>
+    <w:p>
+      <w:r>
+        <w:t>Fetch and cache opportunity description text from SAM.gov. Each description requires one API call. Supports a two-pass prioritized fetch: first fetches descriptions for high-value opportunities matching target NAICS codes and set-aside types (WOSB/8(a)/SBA), then uses remaining budget for the general backlog. Integrated into daily_load.bat (100 descriptions/day).</w:t>
+      </w:r>
+    </w:p>
+    <w:p>
+      <w:pPr>
+        <w:pStyle w:val="Code"/>
+      </w:pPr>
+      <w:r>
+        <w:t>Options:</w:t>
+        <w:br/>
+        <w:t xml:space="preserve">  --missing-only/--all     Only fetch for opportunities without description_text (default: missing-only)</w:t>
+        <w:br/>
+        <w:t xml:space="preserve">  --batch-size N           Commit batch size (default: 100)</w:t>
+        <w:br/>
+        <w:t xml:space="preserve">  --days-back N            Only fetch for opportunities posted in the last N days</w:t>
+        <w:br/>
+        <w:t xml:space="preserve">  --notice-id ID           Fetch description for a single notice ID</w:t>
+        <w:br/>
+        <w:t xml:space="preserve">  --key 1|2                SAM API key (default: 2). Key 2 has 1,000/day quota.</w:t>
+        <w:br/>
+        <w:t xml:space="preserve">  --naics CODES            Priority NAICS codes (comma-separated). Fetches these first.</w:t>
+        <w:br/>
+        <w:t xml:space="preserve">  --set-aside CODES        Priority set-aside codes (e.g. WOSB,8A,SBA). Fetches these first.</w:t>
+        <w:br/>
+        <w:t xml:space="preserve">  --limit N                Max total descriptions to fetch (default: unlimited)</w:t>
+        <w:br/>
+        <w:br/>
+        <w:t>Examples:</w:t>
+        <w:br/>
+        <w:t xml:space="preserve">  python main.py update fetch-descriptions --days-back 7</w:t>
+        <w:br/>
+        <w:t xml:space="preserve">  python main.py update fetch-descriptions --notice-id abc123</w:t>
+        <w:br/>
+        <w:t xml:space="preserve">  python main.py update fetch-descriptions --key 2 --limit 100 --naics 541511,541512 --set-aside WOSB,8A</w:t>
+        <w:br/>
+        <w:t xml:space="preserve">  python main.py update fetch-descriptions --all --batch-size 900</w:t>
+      </w:r>
+    </w:p>
+    <w:p>
+      <w:r>
+        <w:t>On-demand fetch via the C# API is also available. If the description is already cached, the cached text is returned without making an API call:</w:t>
+      </w:r>
+    </w:p>
+    <w:p>
+      <w:pPr>
+        <w:pStyle w:val="Code"/>
+      </w:pPr>
+      <w:r>
+        <w:t>POST /api/v1/opportunities/{noticeId}/fetch-description</w:t>
+        <w:br/>
+        <w:t>Authorization: (authenticated user cookie)</w:t>
       </w:r>
     </w:p>
     <w:p>
@@ -2136,7 +2275,7 @@
         <w:pStyle w:val="Heading2"/>
       </w:pPr>
       <w:r>
-        <w:t>4.11 demand - On-Demand Loading</w:t>
+        <w:t>4.11 job - On-Demand Loading</w:t>
       </w:r>
     </w:p>
     <w:p>
@@ -2144,7 +2283,7 @@
         <w:rPr>
           <w:b/>
         </w:rPr>
-        <w:t>demand process-requests</w:t>
+        <w:t>job process-requests</w:t>
       </w:r>
       <w:r>
         <w:t xml:space="preserve"> - Process queued on-demand data loading requests</w:t>
@@ -3322,7 +3461,300 @@
         <w:pStyle w:val="Heading2"/>
       </w:pPr>
       <w:r>
-        <w:t>7.2 API Key Management</w:t>
+        <w:t>7.2 Federal Hierarchy Management</w:t>
+      </w:r>
+    </w:p>
+    <w:p>
+      <w:r>
+        <w:t>The federal hierarchy (departments, sub-tiers, and offices) is loaded from the SAM.gov Federal Hierarchy API. This data powers the hierarchy browser in the UI and provides agency context for opportunities and awards.</w:t>
+      </w:r>
+    </w:p>
+    <w:p>
+      <w:pPr>
+        <w:pStyle w:val="Heading3"/>
+      </w:pPr>
+      <w:r>
+        <w:t>CLI Hierarchy Commands</w:t>
+      </w:r>
+    </w:p>
+    <w:p>
+      <w:pPr>
+        <w:pStyle w:val="Code"/>
+      </w:pPr>
+      <w:r>
+        <w:t>python main.py load hierarchy                    # Load departments + sub-tiers (levels 1-2)</w:t>
+        <w:br/>
+        <w:t>python main.py load hierarchy --full-refresh     # Truncate and reload all hierarchy data</w:t>
+        <w:br/>
+        <w:t>python main.py load offices                      # Load offices (level 3) under existing sub-tiers</w:t>
+        <w:br/>
+        <w:t>python main.py load offices --max-calls 300      # Limit API calls for office loading</w:t>
+        <w:br/>
+        <w:t>python main.py load offices --days-back 30       # Incremental: only recently updated offices</w:t>
+      </w:r>
+    </w:p>
+    <w:p>
+      <w:pPr>
+        <w:pStyle w:val="Heading3"/>
+      </w:pPr>
+      <w:r>
+        <w:t>Admin UI Refresh Panel (Phase 113)</w:t>
+      </w:r>
+    </w:p>
+    <w:p>
+      <w:r>
+        <w:t>System admins can refresh hierarchy data from the Federal Hierarchy Browser page in the UI. The Hierarchy Data Refresh panel provides:</w:t>
+      </w:r>
+    </w:p>
+    <w:p>
+      <w:pPr>
+        <w:pStyle w:val="ListBullet"/>
+      </w:pPr>
+      <w:r>
+        <w:t>API Key Selection: Choose Key 1 (10/day) or Key 2 (1,000/day) for the refresh</w:t>
+      </w:r>
+    </w:p>
+    <w:p>
+      <w:pPr>
+        <w:pStyle w:val="ListBullet"/>
+      </w:pPr>
+      <w:r>
+        <w:t>Refresh Hierarchy: Reloads departments and sub-tiers (levels 1-2)</w:t>
+      </w:r>
+    </w:p>
+    <w:p>
+      <w:pPr>
+        <w:pStyle w:val="ListBullet"/>
+      </w:pPr>
+      <w:r>
+        <w:t>Refresh Offices: Reloads all offices (level 3). May use ~738 API calls.</w:t>
+      </w:r>
+    </w:p>
+    <w:p>
+      <w:pPr>
+        <w:pStyle w:val="ListBullet"/>
+      </w:pPr>
+      <w:r>
+        <w:t>Full Refresh: Truncates and reloads ALL hierarchy levels (destructive operation)</w:t>
+      </w:r>
+    </w:p>
+    <w:p>
+      <w:pPr>
+        <w:pStyle w:val="ListBullet"/>
+      </w:pPr>
+      <w:r>
+        <w:t>Status Polling: Shows progress while a refresh job is running</w:t>
+      </w:r>
+    </w:p>
+    <w:p>
+      <w:pPr>
+        <w:pStyle w:val="ListBullet"/>
+      </w:pPr>
+      <w:r>
+        <w:t>Last Refresh: Displays timestamp, total record count, and per-level breakdown</w:t>
+      </w:r>
+    </w:p>
+    <w:p>
+      <w:r>
+        <w:t>The refresh is executed by the C# API, which invokes the Python CLI in the background. The UI polls the refresh status endpoint until the job completes.</w:t>
+      </w:r>
+    </w:p>
+    <w:p>
+      <w:pPr>
+        <w:pStyle w:val="Heading3"/>
+      </w:pPr>
+      <w:r>
+        <w:t>Hierarchy Refresh API Endpoints</w:t>
+      </w:r>
+    </w:p>
+    <w:tbl>
+      <w:tblPr>
+        <w:tblStyle w:val="LightGrid-Accent1"/>
+        <w:tblW w:type="auto" w:w="0"/>
+        <w:tblLook w:firstColumn="1" w:firstRow="1" w:lastColumn="0" w:lastRow="0" w:noHBand="0" w:noVBand="1" w:val="04A0"/>
+      </w:tblPr>
+      <w:tblGrid>
+        <w:gridCol w:w="2160"/>
+        <w:gridCol w:w="2160"/>
+        <w:gridCol w:w="2160"/>
+        <w:gridCol w:w="2160"/>
+      </w:tblGrid>
+      <w:tr>
+        <w:tc>
+          <w:tcPr>
+            <w:tcW w:type="dxa" w:w="2160"/>
+          </w:tcPr>
+          <w:p>
+            <w:r>
+              <w:t>Method</w:t>
+            </w:r>
+          </w:p>
+        </w:tc>
+        <w:tc>
+          <w:tcPr>
+            <w:tcW w:type="dxa" w:w="2160"/>
+          </w:tcPr>
+          <w:p>
+            <w:r>
+              <w:t>Endpoint</w:t>
+            </w:r>
+          </w:p>
+        </w:tc>
+        <w:tc>
+          <w:tcPr>
+            <w:tcW w:type="dxa" w:w="2160"/>
+          </w:tcPr>
+          <w:p>
+            <w:r>
+              <w:t>Access</w:t>
+            </w:r>
+          </w:p>
+        </w:tc>
+        <w:tc>
+          <w:tcPr>
+            <w:tcW w:type="dxa" w:w="2160"/>
+          </w:tcPr>
+          <w:p>
+            <w:r>
+              <w:t>Description</w:t>
+            </w:r>
+          </w:p>
+        </w:tc>
+      </w:tr>
+      <w:tr>
+        <w:tc>
+          <w:tcPr>
+            <w:tcW w:type="dxa" w:w="2160"/>
+          </w:tcPr>
+          <w:p>
+            <w:r>
+              <w:t>POST</w:t>
+            </w:r>
+          </w:p>
+        </w:tc>
+        <w:tc>
+          <w:tcPr>
+            <w:tcW w:type="dxa" w:w="2160"/>
+          </w:tcPr>
+          <w:p>
+            <w:r>
+              <w:t>/api/v1/federal-hierarchy/refresh</w:t>
+            </w:r>
+          </w:p>
+        </w:tc>
+        <w:tc>
+          <w:tcPr>
+            <w:tcW w:type="dxa" w:w="2160"/>
+          </w:tcPr>
+          <w:p>
+            <w:r>
+              <w:t>System Admin</w:t>
+            </w:r>
+          </w:p>
+        </w:tc>
+        <w:tc>
+          <w:tcPr>
+            <w:tcW w:type="dxa" w:w="2160"/>
+          </w:tcPr>
+          <w:p>
+            <w:r>
+              <w:t>Trigger a full hierarchy refresh (body: {level, apiKey})</w:t>
+            </w:r>
+          </w:p>
+        </w:tc>
+      </w:tr>
+      <w:tr>
+        <w:tc>
+          <w:tcPr>
+            <w:tcW w:type="dxa" w:w="2160"/>
+          </w:tcPr>
+          <w:p>
+            <w:r>
+              <w:t>GET</w:t>
+            </w:r>
+          </w:p>
+        </w:tc>
+        <w:tc>
+          <w:tcPr>
+            <w:tcW w:type="dxa" w:w="2160"/>
+          </w:tcPr>
+          <w:p>
+            <w:r>
+              <w:t>/api/v1/federal-hierarchy/refresh/status</w:t>
+            </w:r>
+          </w:p>
+        </w:tc>
+        <w:tc>
+          <w:tcPr>
+            <w:tcW w:type="dxa" w:w="2160"/>
+          </w:tcPr>
+          <w:p>
+            <w:r>
+              <w:t>Authenticated</w:t>
+            </w:r>
+          </w:p>
+        </w:tc>
+        <w:tc>
+          <w:tcPr>
+            <w:tcW w:type="dxa" w:w="2160"/>
+          </w:tcPr>
+          <w:p>
+            <w:r>
+              <w:t>Check status of last refresh job</w:t>
+            </w:r>
+          </w:p>
+        </w:tc>
+      </w:tr>
+      <w:tr>
+        <w:tc>
+          <w:tcPr>
+            <w:tcW w:type="dxa" w:w="2160"/>
+          </w:tcPr>
+          <w:p>
+            <w:r>
+              <w:t>POST</w:t>
+            </w:r>
+          </w:p>
+        </w:tc>
+        <w:tc>
+          <w:tcPr>
+            <w:tcW w:type="dxa" w:w="2160"/>
+          </w:tcPr>
+          <w:p>
+            <w:r>
+              <w:t>/api/v1/federal-hierarchy/{fhOrgId}/refresh</w:t>
+            </w:r>
+          </w:p>
+        </w:tc>
+        <w:tc>
+          <w:tcPr>
+            <w:tcW w:type="dxa" w:w="2160"/>
+          </w:tcPr>
+          <w:p>
+            <w:r>
+              <w:t>Authenticated</w:t>
+            </w:r>
+          </w:p>
+        </w:tc>
+        <w:tc>
+          <w:tcPr>
+            <w:tcW w:type="dxa" w:w="2160"/>
+          </w:tcPr>
+          <w:p>
+            <w:r>
+              <w:t>Queue a single-org refresh via the data load poller</w:t>
+            </w:r>
+          </w:p>
+        </w:tc>
+      </w:tr>
+    </w:tbl>
+    <w:p/>
+    <w:p>
+      <w:pPr>
+        <w:pStyle w:val="Heading2"/>
+      </w:pPr>
+      <w:r>
+        <w:t>7.3 API Key Management</w:t>
       </w:r>
     </w:p>
     <w:p>
@@ -3357,7 +3789,7 @@
         <w:pStyle w:val="Heading2"/>
       </w:pPr>
       <w:r>
-        <w:t>7.3 Attachment Pipeline</w:t>
+        <w:t>7.4 Attachment Pipeline</w:t>
       </w:r>
     </w:p>
     <w:p>
@@ -3426,7 +3858,7 @@
         <w:pStyle w:val="Heading2"/>
       </w:pPr>
       <w:r>
-        <w:t>7.4 Pipeline Status</w:t>
+        <w:t>7.5 Pipeline Status</w:t>
       </w:r>
     </w:p>
     <w:p>
@@ -3447,7 +3879,7 @@
         <w:pStyle w:val="Heading2"/>
       </w:pPr>
       <w:r>
-        <w:t>7.5 Change Detection</w:t>
+        <w:t>7.6 Change Detection</w:t>
       </w:r>
     </w:p>
     <w:p>
@@ -3460,7 +3892,7 @@
         <w:pStyle w:val="Heading2"/>
       </w:pPr>
       <w:r>
-        <w:t>7.6 Data Quality Rules</w:t>
+        <w:t>7.7 Data Quality Rules</w:t>
       </w:r>
     </w:p>
     <w:p>
@@ -4018,6 +4450,134 @@
           <w:p>
             <w:r>
               <w:t>Org Admin</w:t>
+            </w:r>
+          </w:p>
+        </w:tc>
+      </w:tr>
+      <w:tr>
+        <w:tc>
+          <w:tcPr>
+            <w:tcW w:type="dxa" w:w="2880"/>
+          </w:tcPr>
+          <w:p>
+            <w:r>
+              <w:t>POST</w:t>
+            </w:r>
+          </w:p>
+        </w:tc>
+        <w:tc>
+          <w:tcPr>
+            <w:tcW w:type="dxa" w:w="2880"/>
+          </w:tcPr>
+          <w:p>
+            <w:r>
+              <w:t>/api/v1/federal-hierarchy/refresh</w:t>
+            </w:r>
+          </w:p>
+        </w:tc>
+        <w:tc>
+          <w:tcPr>
+            <w:tcW w:type="dxa" w:w="2880"/>
+          </w:tcPr>
+          <w:p>
+            <w:r>
+              <w:t>System Admin</w:t>
+            </w:r>
+          </w:p>
+        </w:tc>
+      </w:tr>
+      <w:tr>
+        <w:tc>
+          <w:tcPr>
+            <w:tcW w:type="dxa" w:w="2880"/>
+          </w:tcPr>
+          <w:p>
+            <w:r>
+              <w:t>GET</w:t>
+            </w:r>
+          </w:p>
+        </w:tc>
+        <w:tc>
+          <w:tcPr>
+            <w:tcW w:type="dxa" w:w="2880"/>
+          </w:tcPr>
+          <w:p>
+            <w:r>
+              <w:t>/api/v1/federal-hierarchy/refresh/status</w:t>
+            </w:r>
+          </w:p>
+        </w:tc>
+        <w:tc>
+          <w:tcPr>
+            <w:tcW w:type="dxa" w:w="2880"/>
+          </w:tcPr>
+          <w:p>
+            <w:r>
+              <w:t>Authenticated</w:t>
+            </w:r>
+          </w:p>
+        </w:tc>
+      </w:tr>
+      <w:tr>
+        <w:tc>
+          <w:tcPr>
+            <w:tcW w:type="dxa" w:w="2880"/>
+          </w:tcPr>
+          <w:p>
+            <w:r>
+              <w:t>POST</w:t>
+            </w:r>
+          </w:p>
+        </w:tc>
+        <w:tc>
+          <w:tcPr>
+            <w:tcW w:type="dxa" w:w="2880"/>
+          </w:tcPr>
+          <w:p>
+            <w:r>
+              <w:t>/api/v1/opportunities/{noticeId}/fetch-description</w:t>
+            </w:r>
+          </w:p>
+        </w:tc>
+        <w:tc>
+          <w:tcPr>
+            <w:tcW w:type="dxa" w:w="2880"/>
+          </w:tcPr>
+          <w:p>
+            <w:r>
+              <w:t>Authenticated</w:t>
+            </w:r>
+          </w:p>
+        </w:tc>
+      </w:tr>
+      <w:tr>
+        <w:tc>
+          <w:tcPr>
+            <w:tcW w:type="dxa" w:w="2880"/>
+          </w:tcPr>
+          <w:p>
+            <w:r>
+              <w:t>POST</w:t>
+            </w:r>
+          </w:p>
+        </w:tc>
+        <w:tc>
+          <w:tcPr>
+            <w:tcW w:type="dxa" w:w="2880"/>
+          </w:tcPr>
+          <w:p>
+            <w:r>
+              <w:t>/api/v1/federal-hierarchy/{fhOrgId}/refresh</w:t>
+            </w:r>
+          </w:p>
+        </w:tc>
+        <w:tc>
+          <w:tcPr>
+            <w:tcW w:type="dxa" w:w="2880"/>
+          </w:tcPr>
+          <w:p>
+            <w:r>
+              <w:t>Authenticated</w:t>
             </w:r>
           </w:p>
         </w:tc>

</xml_diff>